<commit_message>
F.042: eliminar la instrucción de cabecera del formulario rellenado
'[El Oferente deberá completar este formulario de acuerdo con las
instrucciones siguientes…]' es una indicación al oferente, no parte del
documento que se entrega: fuera del rellenado. La leyenda del bloque de
firma del F.034 ('Persona o personas autorizadas a firmar…') se queda —
es parte del formato oficial del bloque de firma.

Co-Authored-By: Claude Opus 4.8 (1M context) <noreply@anthropic.com>
</commit_message>
<xml_diff>
--- a/plantillas/dgcp/SNCC_F042_Informacion_Oferente-tpl.docx
+++ b/plantillas/dgcp/SNCC_F042_Informacion_Oferente-tpl.docx
@@ -1674,7 +1674,7 @@
           <w:szCs w:val="20"/>
           <w:lang w:val="es-DO"/>
         </w:rPr>
-        <w:t xml:space="preserve">[El Oferente deberá completar este formulario de acuerdo con las instrucciones </w:t>
+        <w:t xml:space="preserve"/>
       </w:r>
       <w:r>
         <w:rPr>
@@ -1685,7 +1685,7 @@
           <w:szCs w:val="20"/>
           <w:lang w:val="es-DO"/>
         </w:rPr>
-        <w:t xml:space="preserve">siguientes. </w:t>
+        <w:t xml:space="preserve"/>
       </w:r>
       <w:r>
         <w:rPr>
@@ -1696,7 +1696,7 @@
           <w:szCs w:val="20"/>
           <w:lang w:val="es-DO"/>
         </w:rPr>
-        <w:t>No se aceptará ninguna alteración a est</w:t>
+        <w:t xml:space="preserve"/>
       </w:r>
       <w:r>
         <w:rPr>
@@ -1707,7 +1707,7 @@
           <w:szCs w:val="20"/>
           <w:lang w:val="es-DO"/>
         </w:rPr>
-        <w:t>e formulario ni se aceptarán su</w:t>
+        <w:t xml:space="preserve"/>
       </w:r>
       <w:r>
         <w:rPr>
@@ -1718,7 +1718,7 @@
           <w:szCs w:val="20"/>
           <w:lang w:val="es-DO"/>
         </w:rPr>
-        <w:t>stitutos.]</w:t>
+        <w:t xml:space="preserve"/>
       </w:r>
     </w:p>
     <w:p>

</xml_diff>